<commit_message>
docs(report): update homework 1 report
</commit_message>
<xml_diff>
--- a/Homework 1.docx
+++ b/Homework 1.docx
@@ -4,17 +4,14 @@
   <w:body>
     <w:p>
       <w:r>
-        <w:br/>
-        <w:t xml:space="preserve">Homework 1 </w:t>
-      </w:r>
-    </w:p>
-    <w:p>
-      <w:r>
+        <w:rPr>
+          <w:noProof/>
+        </w:rPr>
         <w:drawing>
-          <wp:inline distT="0" distB="0" distL="0" distR="0" wp14:anchorId="0E3B67BA" wp14:editId="2E286952">
-            <wp:extent cx="5943600" cy="2829560"/>
-            <wp:effectExtent l="0" t="0" r="0" b="8890"/>
-            <wp:docPr id="1" name="Picture 1"/>
+          <wp:inline distT="0" distB="0" distL="0" distR="0">
+            <wp:extent cx="5943600" cy="3316605"/>
+            <wp:effectExtent l="0" t="0" r="0" b="0"/>
+            <wp:docPr id="12" name="Picture 12"/>
             <wp:cNvGraphicFramePr>
               <a:graphicFrameLocks xmlns:a="http://schemas.openxmlformats.org/drawingml/2006/main" noChangeAspect="1"/>
             </wp:cNvGraphicFramePr>
@@ -22,11 +19,17 @@
               <a:graphicData uri="http://schemas.openxmlformats.org/drawingml/2006/picture">
                 <pic:pic xmlns:pic="http://schemas.openxmlformats.org/drawingml/2006/picture">
                   <pic:nvPicPr>
-                    <pic:cNvPr id="1" name=""/>
+                    <pic:cNvPr id="12" name="Screenshot 2026-10-28 132037.png"/>
                     <pic:cNvPicPr/>
                   </pic:nvPicPr>
                   <pic:blipFill>
-                    <a:blip r:embed="rId4"/>
+                    <a:blip r:embed="rId6" cstate="print">
+                      <a:extLst>
+                        <a:ext uri="{28A0092B-C50C-407E-A947-70E740481C1C}">
+                          <a14:useLocalDpi xmlns:a14="http://schemas.microsoft.com/office/drawing/2010/main" val="0"/>
+                        </a:ext>
+                      </a:extLst>
+                    </a:blip>
                     <a:stretch>
                       <a:fillRect/>
                     </a:stretch>
@@ -34,7 +37,7 @@
                   <pic:spPr>
                     <a:xfrm>
                       <a:off x="0" y="0"/>
-                      <a:ext cx="5943600" cy="2829560"/>
+                      <a:ext cx="5943600" cy="3316605"/>
                     </a:xfrm>
                     <a:prstGeom prst="rect">
                       <a:avLst/>
@@ -48,12 +51,28 @@
       </w:r>
     </w:p>
     <w:p>
-      <w:r>
+      <w:pPr>
+        <w:spacing w:before="40" w:after="160"/>
+        <w:jc w:val="center"/>
+      </w:pPr>
+      <w:r>
+        <w:rPr>
+          <w:i/>
+          <w:sz w:val="18"/>
+        </w:rPr>
+        <w:t>Figure 1. Accessibility-focused DataGrid interface with visible focus styling inspected in Chrome DevTools.</w:t>
+      </w:r>
+    </w:p>
+    <w:p>
+      <w:r>
+        <w:rPr>
+          <w:noProof/>
+        </w:rPr>
         <w:drawing>
-          <wp:inline distT="0" distB="0" distL="0" distR="0" wp14:anchorId="1C56599F" wp14:editId="3D75D7C3">
-            <wp:extent cx="5943600" cy="2835275"/>
-            <wp:effectExtent l="0" t="0" r="0" b="3175"/>
-            <wp:docPr id="2" name="Picture 2"/>
+          <wp:inline distT="0" distB="0" distL="0" distR="0">
+            <wp:extent cx="5943600" cy="3810635"/>
+            <wp:effectExtent l="0" t="0" r="0" b="0"/>
+            <wp:docPr id="13" name="Picture 13"/>
             <wp:cNvGraphicFramePr>
               <a:graphicFrameLocks xmlns:a="http://schemas.openxmlformats.org/drawingml/2006/main" noChangeAspect="1"/>
             </wp:cNvGraphicFramePr>
@@ -61,11 +80,17 @@
               <a:graphicData uri="http://schemas.openxmlformats.org/drawingml/2006/picture">
                 <pic:pic xmlns:pic="http://schemas.openxmlformats.org/drawingml/2006/picture">
                   <pic:nvPicPr>
-                    <pic:cNvPr id="1" name=""/>
+                    <pic:cNvPr id="13" name="Screenshot 2026-10-28 132201.png"/>
                     <pic:cNvPicPr/>
                   </pic:nvPicPr>
                   <pic:blipFill>
-                    <a:blip r:embed="rId5"/>
+                    <a:blip r:embed="rId7" cstate="print">
+                      <a:extLst>
+                        <a:ext uri="{28A0092B-C50C-407E-A947-70E740481C1C}">
+                          <a14:useLocalDpi xmlns:a14="http://schemas.microsoft.com/office/drawing/2010/main" val="0"/>
+                        </a:ext>
+                      </a:extLst>
+                    </a:blip>
                     <a:stretch>
                       <a:fillRect/>
                     </a:stretch>
@@ -73,7 +98,7 @@
                   <pic:spPr>
                     <a:xfrm>
                       <a:off x="0" y="0"/>
-                      <a:ext cx="5943600" cy="2835275"/>
+                      <a:ext cx="5943600" cy="3810635"/>
                     </a:xfrm>
                     <a:prstGeom prst="rect">
                       <a:avLst/>
@@ -87,13 +112,29 @@
       </w:r>
     </w:p>
     <w:p>
-      <w:r>
+      <w:pPr>
+        <w:spacing w:before="40" w:after="160"/>
+        <w:jc w:val="center"/>
+      </w:pPr>
+      <w:r>
+        <w:rPr>
+          <w:i/>
+          <w:sz w:val="18"/>
+        </w:rPr>
+        <w:t>Figure 2. Semantic DataGrid structure, ARIA attributes, and roving tabindex behavior verified in Chrome DevTools.</w:t>
+      </w:r>
+    </w:p>
+    <w:p>
+      <w:r>
+        <w:rPr>
+          <w:noProof/>
+        </w:rPr>
         <w:lastRenderedPageBreak/>
         <w:drawing>
-          <wp:inline distT="0" distB="0" distL="0" distR="0" wp14:anchorId="7AFF7C7E" wp14:editId="0D64761B">
-            <wp:extent cx="5943600" cy="3408680"/>
-            <wp:effectExtent l="0" t="0" r="0" b="1270"/>
-            <wp:docPr id="3" name="Picture 3"/>
+          <wp:inline distT="0" distB="0" distL="0" distR="0">
+            <wp:extent cx="5943600" cy="3091815"/>
+            <wp:effectExtent l="0" t="0" r="0" b="0"/>
+            <wp:docPr id="14" name="Picture 14"/>
             <wp:cNvGraphicFramePr>
               <a:graphicFrameLocks xmlns:a="http://schemas.openxmlformats.org/drawingml/2006/main" noChangeAspect="1"/>
             </wp:cNvGraphicFramePr>
@@ -101,11 +142,17 @@
               <a:graphicData uri="http://schemas.openxmlformats.org/drawingml/2006/picture">
                 <pic:pic xmlns:pic="http://schemas.openxmlformats.org/drawingml/2006/picture">
                   <pic:nvPicPr>
-                    <pic:cNvPr id="1" name=""/>
+                    <pic:cNvPr id="14" name="Screenshot 2026-10-28 132603.png"/>
                     <pic:cNvPicPr/>
                   </pic:nvPicPr>
                   <pic:blipFill>
-                    <a:blip r:embed="rId6"/>
+                    <a:blip r:embed="rId8" cstate="print">
+                      <a:extLst>
+                        <a:ext uri="{28A0092B-C50C-407E-A947-70E740481C1C}">
+                          <a14:useLocalDpi xmlns:a14="http://schemas.microsoft.com/office/drawing/2010/main" val="0"/>
+                        </a:ext>
+                      </a:extLst>
+                    </a:blip>
                     <a:stretch>
                       <a:fillRect/>
                     </a:stretch>
@@ -113,7 +160,7 @@
                   <pic:spPr>
                     <a:xfrm>
                       <a:off x="0" y="0"/>
-                      <a:ext cx="5943600" cy="3408680"/>
+                      <a:ext cx="5943600" cy="3091815"/>
                     </a:xfrm>
                     <a:prstGeom prst="rect">
                       <a:avLst/>
@@ -127,12 +174,28 @@
       </w:r>
     </w:p>
     <w:p>
-      <w:r>
+      <w:pPr>
+        <w:spacing w:before="40" w:after="160"/>
+        <w:jc w:val="center"/>
+      </w:pPr>
+      <w:r>
+        <w:rPr>
+          <w:i/>
+          <w:sz w:val="18"/>
+        </w:rPr>
+        <w:t>Figure 3. Lighthouse accessibility audit achieving a score of 100/100.</w:t>
+      </w:r>
+    </w:p>
+    <w:p>
+      <w:r>
+        <w:rPr>
+          <w:noProof/>
+        </w:rPr>
         <w:drawing>
-          <wp:inline distT="0" distB="0" distL="0" distR="0" wp14:anchorId="3FA2192F" wp14:editId="1BE8BE4E">
-            <wp:extent cx="5943600" cy="2522855"/>
-            <wp:effectExtent l="0" t="0" r="0" b="0"/>
-            <wp:docPr id="4" name="Picture 4"/>
+          <wp:inline distT="0" distB="0" distL="0" distR="0">
+            <wp:extent cx="5943600" cy="2799715"/>
+            <wp:effectExtent l="0" t="0" r="0" b="635"/>
+            <wp:docPr id="15" name="Picture 15"/>
             <wp:cNvGraphicFramePr>
               <a:graphicFrameLocks xmlns:a="http://schemas.openxmlformats.org/drawingml/2006/main" noChangeAspect="1"/>
             </wp:cNvGraphicFramePr>
@@ -140,11 +203,17 @@
               <a:graphicData uri="http://schemas.openxmlformats.org/drawingml/2006/picture">
                 <pic:pic xmlns:pic="http://schemas.openxmlformats.org/drawingml/2006/picture">
                   <pic:nvPicPr>
-                    <pic:cNvPr id="1" name=""/>
+                    <pic:cNvPr id="15" name="Screenshot 2026-10-28 133942.png"/>
                     <pic:cNvPicPr/>
                   </pic:nvPicPr>
                   <pic:blipFill>
-                    <a:blip r:embed="rId7"/>
+                    <a:blip r:embed="rId9" cstate="print">
+                      <a:extLst>
+                        <a:ext uri="{28A0092B-C50C-407E-A947-70E740481C1C}">
+                          <a14:useLocalDpi xmlns:a14="http://schemas.microsoft.com/office/drawing/2010/main" val="0"/>
+                        </a:ext>
+                      </a:extLst>
+                    </a:blip>
                     <a:stretch>
                       <a:fillRect/>
                     </a:stretch>
@@ -152,7 +221,7 @@
                   <pic:spPr>
                     <a:xfrm>
                       <a:off x="0" y="0"/>
-                      <a:ext cx="5943600" cy="2522855"/>
+                      <a:ext cx="5943600" cy="2799715"/>
                     </a:xfrm>
                     <a:prstGeom prst="rect">
                       <a:avLst/>
@@ -166,91 +235,35 @@
       </w:r>
     </w:p>
     <w:p>
-      <w:r>
-        <w:drawing>
-          <wp:inline distT="0" distB="0" distL="0" distR="0" wp14:anchorId="71DB4974" wp14:editId="5E656070">
-            <wp:extent cx="5943600" cy="1960245"/>
-            <wp:effectExtent l="0" t="0" r="0" b="1905"/>
-            <wp:docPr id="5" name="Picture 5"/>
-            <wp:cNvGraphicFramePr>
-              <a:graphicFrameLocks xmlns:a="http://schemas.openxmlformats.org/drawingml/2006/main" noChangeAspect="1"/>
-            </wp:cNvGraphicFramePr>
-            <a:graphic xmlns:a="http://schemas.openxmlformats.org/drawingml/2006/main">
-              <a:graphicData uri="http://schemas.openxmlformats.org/drawingml/2006/picture">
-                <pic:pic xmlns:pic="http://schemas.openxmlformats.org/drawingml/2006/picture">
-                  <pic:nvPicPr>
-                    <pic:cNvPr id="1" name=""/>
-                    <pic:cNvPicPr/>
-                  </pic:nvPicPr>
-                  <pic:blipFill>
-                    <a:blip r:embed="rId8"/>
-                    <a:stretch>
-                      <a:fillRect/>
-                    </a:stretch>
-                  </pic:blipFill>
-                  <pic:spPr>
-                    <a:xfrm>
-                      <a:off x="0" y="0"/>
-                      <a:ext cx="5943600" cy="1960245"/>
-                    </a:xfrm>
-                    <a:prstGeom prst="rect">
-                      <a:avLst/>
-                    </a:prstGeom>
-                  </pic:spPr>
-                </pic:pic>
-              </a:graphicData>
-            </a:graphic>
-          </wp:inline>
-        </w:drawing>
-      </w:r>
-    </w:p>
-    <w:p>
-      <w:r>
+      <w:pPr>
+        <w:spacing w:before="40" w:after="160"/>
+        <w:jc w:val="center"/>
+      </w:pPr>
+      <w:r>
+        <w:rPr>
+          <w:i/>
+          <w:sz w:val="18"/>
+        </w:rPr>
+        <w:t>Figure 4. Final Lighthouse audit achieving 100/100 for Accessibility and Best Practices.</w:t>
+      </w:r>
+    </w:p>
+    <w:p>
+      <w:r>
+        <w:br/>
+        <w:t xml:space="preserve">Homework 1 </w:t>
+      </w:r>
+    </w:p>
+    <w:p>
+      <w:r>
+        <w:rPr>
+          <w:noProof/>
+        </w:rPr>
         <w:lastRenderedPageBreak/>
         <w:drawing>
-          <wp:inline distT="0" distB="0" distL="0" distR="0" wp14:anchorId="6A708078" wp14:editId="780CA6B0">
-            <wp:extent cx="5943600" cy="2673350"/>
-            <wp:effectExtent l="0" t="0" r="0" b="0"/>
-            <wp:docPr id="6" name="Picture 6"/>
-            <wp:cNvGraphicFramePr>
-              <a:graphicFrameLocks xmlns:a="http://schemas.openxmlformats.org/drawingml/2006/main" noChangeAspect="1"/>
-            </wp:cNvGraphicFramePr>
-            <a:graphic xmlns:a="http://schemas.openxmlformats.org/drawingml/2006/main">
-              <a:graphicData uri="http://schemas.openxmlformats.org/drawingml/2006/picture">
-                <pic:pic xmlns:pic="http://schemas.openxmlformats.org/drawingml/2006/picture">
-                  <pic:nvPicPr>
-                    <pic:cNvPr id="1" name=""/>
-                    <pic:cNvPicPr/>
-                  </pic:nvPicPr>
-                  <pic:blipFill>
-                    <a:blip r:embed="rId9"/>
-                    <a:stretch>
-                      <a:fillRect/>
-                    </a:stretch>
-                  </pic:blipFill>
-                  <pic:spPr>
-                    <a:xfrm>
-                      <a:off x="0" y="0"/>
-                      <a:ext cx="5943600" cy="2673350"/>
-                    </a:xfrm>
-                    <a:prstGeom prst="rect">
-                      <a:avLst/>
-                    </a:prstGeom>
-                  </pic:spPr>
-                </pic:pic>
-              </a:graphicData>
-            </a:graphic>
-          </wp:inline>
-        </w:drawing>
-      </w:r>
-    </w:p>
-    <w:p>
-      <w:r>
-        <w:drawing>
-          <wp:inline distT="0" distB="0" distL="0" distR="0" wp14:anchorId="142C52DD" wp14:editId="0EA8194F">
-            <wp:extent cx="5943600" cy="2519045"/>
-            <wp:effectExtent l="0" t="0" r="0" b="0"/>
-            <wp:docPr id="7" name="Picture 7"/>
+          <wp:inline distT="0" distB="0" distL="0" distR="0" wp14:anchorId="0E3B67BA" wp14:editId="2E286952">
+            <wp:extent cx="5943600" cy="2829560"/>
+            <wp:effectExtent l="0" t="0" r="0" b="8890"/>
+            <wp:docPr id="1" name="Picture 1"/>
             <wp:cNvGraphicFramePr>
               <a:graphicFrameLocks xmlns:a="http://schemas.openxmlformats.org/drawingml/2006/main" noChangeAspect="1"/>
             </wp:cNvGraphicFramePr>
@@ -270,7 +283,7 @@
                   <pic:spPr>
                     <a:xfrm>
                       <a:off x="0" y="0"/>
-                      <a:ext cx="5943600" cy="2519045"/>
+                      <a:ext cx="5943600" cy="2829560"/>
                     </a:xfrm>
                     <a:prstGeom prst="rect">
                       <a:avLst/>
@@ -284,13 +297,29 @@
       </w:r>
     </w:p>
     <w:p>
-      <w:r>
-        <w:lastRenderedPageBreak/>
+      <w:pPr>
+        <w:keepNext w:val="0"/>
+        <w:spacing w:before="40" w:after="160"/>
+        <w:jc w:val="center"/>
+      </w:pPr>
+      <w:r>
+        <w:rPr>
+          <w:i/>
+          <w:sz w:val="18"/>
+        </w:rPr>
+        <w:t>Figure 5. Semantic HTML table structure verified in Chrome DevTools using table, thead, tbody, th, and td elements.</w:t>
+      </w:r>
+    </w:p>
+    <w:p>
+      <w:r>
+        <w:rPr>
+          <w:noProof/>
+        </w:rPr>
         <w:drawing>
-          <wp:inline distT="0" distB="0" distL="0" distR="0" wp14:anchorId="0A8C63F2" wp14:editId="0E27A70B">
-            <wp:extent cx="5943600" cy="3112135"/>
-            <wp:effectExtent l="0" t="0" r="0" b="0"/>
-            <wp:docPr id="8" name="Picture 8"/>
+          <wp:inline distT="0" distB="0" distL="0" distR="0" wp14:anchorId="1C56599F" wp14:editId="3D75D7C3">
+            <wp:extent cx="5943600" cy="2835275"/>
+            <wp:effectExtent l="0" t="0" r="0" b="3175"/>
+            <wp:docPr id="2" name="Picture 2"/>
             <wp:cNvGraphicFramePr>
               <a:graphicFrameLocks xmlns:a="http://schemas.openxmlformats.org/drawingml/2006/main" noChangeAspect="1"/>
             </wp:cNvGraphicFramePr>
@@ -310,7 +339,7 @@
                   <pic:spPr>
                     <a:xfrm>
                       <a:off x="0" y="0"/>
-                      <a:ext cx="5943600" cy="3112135"/>
+                      <a:ext cx="5943600" cy="2835275"/>
                     </a:xfrm>
                     <a:prstGeom prst="rect">
                       <a:avLst/>
@@ -324,12 +353,30 @@
       </w:r>
     </w:p>
     <w:p>
-      <w:r>
+      <w:pPr>
+        <w:keepNext w:val="0"/>
+        <w:spacing w:before="40" w:after="160"/>
+        <w:jc w:val="center"/>
+      </w:pPr>
+      <w:r>
+        <w:rPr>
+          <w:i/>
+          <w:sz w:val="18"/>
+        </w:rPr>
+        <w:t>Figure 6. Descending Age column sorting with the accessible aria-sort state verified in Chrome DevTools.</w:t>
+      </w:r>
+    </w:p>
+    <w:p>
+      <w:r>
+        <w:rPr>
+          <w:noProof/>
+        </w:rPr>
+        <w:lastRenderedPageBreak/>
         <w:drawing>
-          <wp:inline distT="0" distB="0" distL="0" distR="0" wp14:anchorId="5194F16E" wp14:editId="0DA926A4">
-            <wp:extent cx="5943600" cy="2890520"/>
-            <wp:effectExtent l="0" t="0" r="0" b="5080"/>
-            <wp:docPr id="9" name="Picture 9"/>
+          <wp:inline distT="0" distB="0" distL="0" distR="0" wp14:anchorId="7AFF7C7E" wp14:editId="0D64761B">
+            <wp:extent cx="5943600" cy="3408680"/>
+            <wp:effectExtent l="0" t="0" r="0" b="1270"/>
+            <wp:docPr id="3" name="Picture 3"/>
             <wp:cNvGraphicFramePr>
               <a:graphicFrameLocks xmlns:a="http://schemas.openxmlformats.org/drawingml/2006/main" noChangeAspect="1"/>
             </wp:cNvGraphicFramePr>
@@ -349,7 +396,7 @@
                   <pic:spPr>
                     <a:xfrm>
                       <a:off x="0" y="0"/>
-                      <a:ext cx="5943600" cy="2890520"/>
+                      <a:ext cx="5943600" cy="3408680"/>
                     </a:xfrm>
                     <a:prstGeom prst="rect">
                       <a:avLst/>
@@ -363,13 +410,29 @@
       </w:r>
     </w:p>
     <w:p>
-      <w:r>
-        <w:lastRenderedPageBreak/>
+      <w:pPr>
+        <w:keepNext w:val="0"/>
+        <w:spacing w:before="40" w:after="160"/>
+        <w:jc w:val="center"/>
+      </w:pPr>
+      <w:r>
+        <w:rPr>
+          <w:i/>
+          <w:sz w:val="18"/>
+        </w:rPr>
+        <w:t>Figure 7. Ascending Age column sorting with aria-sort="ascending" verified in Chrome DevTools.</w:t>
+      </w:r>
+    </w:p>
+    <w:p>
+      <w:r>
+        <w:rPr>
+          <w:noProof/>
+        </w:rPr>
         <w:drawing>
-          <wp:inline distT="0" distB="0" distL="0" distR="0" wp14:anchorId="529A8F8B" wp14:editId="61111C9A">
-            <wp:extent cx="5943600" cy="3238500"/>
+          <wp:inline distT="0" distB="0" distL="0" distR="0" wp14:anchorId="3FA2192F" wp14:editId="1BE8BE4E">
+            <wp:extent cx="5943600" cy="2522855"/>
             <wp:effectExtent l="0" t="0" r="0" b="0"/>
-            <wp:docPr id="10" name="Picture 10"/>
+            <wp:docPr id="4" name="Picture 4"/>
             <wp:cNvGraphicFramePr>
               <a:graphicFrameLocks xmlns:a="http://schemas.openxmlformats.org/drawingml/2006/main" noChangeAspect="1"/>
             </wp:cNvGraphicFramePr>
@@ -389,7 +452,7 @@
                   <pic:spPr>
                     <a:xfrm>
                       <a:off x="0" y="0"/>
-                      <a:ext cx="5943600" cy="3238500"/>
+                      <a:ext cx="5943600" cy="2522855"/>
                     </a:xfrm>
                     <a:prstGeom prst="rect">
                       <a:avLst/>
@@ -403,12 +466,29 @@
       </w:r>
     </w:p>
     <w:p>
-      <w:r>
+      <w:pPr>
+        <w:keepNext w:val="0"/>
+        <w:spacing w:before="40" w:after="160"/>
+        <w:jc w:val="center"/>
+      </w:pPr>
+      <w:r>
+        <w:rPr>
+          <w:i/>
+          <w:sz w:val="18"/>
+        </w:rPr>
+        <w:t>Figure 8. Employee filtering by Engineering combined with ascending Age sorting.</w:t>
+      </w:r>
+    </w:p>
+    <w:p>
+      <w:r>
+        <w:rPr>
+          <w:noProof/>
+        </w:rPr>
         <w:drawing>
-          <wp:inline distT="0" distB="0" distL="0" distR="0" wp14:anchorId="03BB7BB8" wp14:editId="0B7AC6D5">
-            <wp:extent cx="5943600" cy="3421380"/>
-            <wp:effectExtent l="0" t="0" r="0" b="7620"/>
-            <wp:docPr id="11" name="Picture 11"/>
+          <wp:inline distT="0" distB="0" distL="0" distR="0" wp14:anchorId="71DB4974" wp14:editId="5E656070">
+            <wp:extent cx="5943600" cy="1960245"/>
+            <wp:effectExtent l="0" t="0" r="0" b="1905"/>
+            <wp:docPr id="5" name="Picture 5"/>
             <wp:cNvGraphicFramePr>
               <a:graphicFrameLocks xmlns:a="http://schemas.openxmlformats.org/drawingml/2006/main" noChangeAspect="1"/>
             </wp:cNvGraphicFramePr>
@@ -428,6 +508,345 @@
                   <pic:spPr>
                     <a:xfrm>
                       <a:off x="0" y="0"/>
+                      <a:ext cx="5943600" cy="1960245"/>
+                    </a:xfrm>
+                    <a:prstGeom prst="rect">
+                      <a:avLst/>
+                    </a:prstGeom>
+                  </pic:spPr>
+                </pic:pic>
+              </a:graphicData>
+            </a:graphic>
+          </wp:inline>
+        </w:drawing>
+      </w:r>
+    </w:p>
+    <w:p>
+      <w:pPr>
+        <w:keepNext w:val="0"/>
+        <w:spacing w:before="40" w:after="160"/>
+        <w:jc w:val="center"/>
+      </w:pPr>
+      <w:r>
+        <w:rPr>
+          <w:i/>
+          <w:sz w:val="18"/>
+        </w:rPr>
+        <w:t>Figure 9. Employee filtering by Engineering combined with descending Age sorting.</w:t>
+      </w:r>
+    </w:p>
+    <w:p>
+      <w:r>
+        <w:rPr>
+          <w:noProof/>
+        </w:rPr>
+        <w:lastRenderedPageBreak/>
+        <w:drawing>
+          <wp:inline distT="0" distB="0" distL="0" distR="0" wp14:anchorId="6A708078" wp14:editId="780CA6B0">
+            <wp:extent cx="5943600" cy="2673350"/>
+            <wp:effectExtent l="0" t="0" r="0" b="0"/>
+            <wp:docPr id="6" name="Picture 6"/>
+            <wp:cNvGraphicFramePr>
+              <a:graphicFrameLocks xmlns:a="http://schemas.openxmlformats.org/drawingml/2006/main" noChangeAspect="1"/>
+            </wp:cNvGraphicFramePr>
+            <a:graphic xmlns:a="http://schemas.openxmlformats.org/drawingml/2006/main">
+              <a:graphicData uri="http://schemas.openxmlformats.org/drawingml/2006/picture">
+                <pic:pic xmlns:pic="http://schemas.openxmlformats.org/drawingml/2006/picture">
+                  <pic:nvPicPr>
+                    <pic:cNvPr id="1" name=""/>
+                    <pic:cNvPicPr/>
+                  </pic:nvPicPr>
+                  <pic:blipFill>
+                    <a:blip r:embed="rId15"/>
+                    <a:stretch>
+                      <a:fillRect/>
+                    </a:stretch>
+                  </pic:blipFill>
+                  <pic:spPr>
+                    <a:xfrm>
+                      <a:off x="0" y="0"/>
+                      <a:ext cx="5943600" cy="2673350"/>
+                    </a:xfrm>
+                    <a:prstGeom prst="rect">
+                      <a:avLst/>
+                    </a:prstGeom>
+                  </pic:spPr>
+                </pic:pic>
+              </a:graphicData>
+            </a:graphic>
+          </wp:inline>
+        </w:drawing>
+      </w:r>
+    </w:p>
+    <w:p>
+      <w:pPr>
+        <w:keepNext w:val="0"/>
+        <w:spacing w:before="40" w:after="160"/>
+        <w:jc w:val="center"/>
+      </w:pPr>
+      <w:r>
+        <w:rPr>
+          <w:i/>
+          <w:sz w:val="18"/>
+        </w:rPr>
+        <w:t>Figure 10. DataGrid pagination on Page 2 of 2 with the Next button correctly disabled.</w:t>
+      </w:r>
+    </w:p>
+    <w:p>
+      <w:r>
+        <w:rPr>
+          <w:noProof/>
+        </w:rPr>
+        <w:drawing>
+          <wp:inline distT="0" distB="0" distL="0" distR="0" wp14:anchorId="142C52DD" wp14:editId="0EA8194F">
+            <wp:extent cx="5943600" cy="2519045"/>
+            <wp:effectExtent l="0" t="0" r="0" b="0"/>
+            <wp:docPr id="7" name="Picture 7"/>
+            <wp:cNvGraphicFramePr>
+              <a:graphicFrameLocks xmlns:a="http://schemas.openxmlformats.org/drawingml/2006/main" noChangeAspect="1"/>
+            </wp:cNvGraphicFramePr>
+            <a:graphic xmlns:a="http://schemas.openxmlformats.org/drawingml/2006/main">
+              <a:graphicData uri="http://schemas.openxmlformats.org/drawingml/2006/picture">
+                <pic:pic xmlns:pic="http://schemas.openxmlformats.org/drawingml/2006/picture">
+                  <pic:nvPicPr>
+                    <pic:cNvPr id="1" name=""/>
+                    <pic:cNvPicPr/>
+                  </pic:nvPicPr>
+                  <pic:blipFill>
+                    <a:blip r:embed="rId16"/>
+                    <a:stretch>
+                      <a:fillRect/>
+                    </a:stretch>
+                  </pic:blipFill>
+                  <pic:spPr>
+                    <a:xfrm>
+                      <a:off x="0" y="0"/>
+                      <a:ext cx="5943600" cy="2519045"/>
+                    </a:xfrm>
+                    <a:prstGeom prst="rect">
+                      <a:avLst/>
+                    </a:prstGeom>
+                  </pic:spPr>
+                </pic:pic>
+              </a:graphicData>
+            </a:graphic>
+          </wp:inline>
+        </w:drawing>
+      </w:r>
+    </w:p>
+    <w:p>
+      <w:pPr>
+        <w:keepNext w:val="0"/>
+        <w:spacing w:before="40" w:after="160"/>
+        <w:jc w:val="center"/>
+      </w:pPr>
+      <w:r>
+        <w:rPr>
+          <w:i/>
+          <w:sz w:val="18"/>
+        </w:rPr>
+        <w:t>Figure 11. Pagination automatically adjusted to Page 1 of 1 after filtering the employee data.</w:t>
+      </w:r>
+    </w:p>
+    <w:p>
+      <w:r>
+        <w:rPr>
+          <w:noProof/>
+        </w:rPr>
+        <w:lastRenderedPageBreak/>
+        <w:drawing>
+          <wp:inline distT="0" distB="0" distL="0" distR="0" wp14:anchorId="0A8C63F2" wp14:editId="0E27A70B">
+            <wp:extent cx="5943600" cy="3112135"/>
+            <wp:effectExtent l="0" t="0" r="0" b="0"/>
+            <wp:docPr id="8" name="Picture 8"/>
+            <wp:cNvGraphicFramePr>
+              <a:graphicFrameLocks xmlns:a="http://schemas.openxmlformats.org/drawingml/2006/main" noChangeAspect="1"/>
+            </wp:cNvGraphicFramePr>
+            <a:graphic xmlns:a="http://schemas.openxmlformats.org/drawingml/2006/main">
+              <a:graphicData uri="http://schemas.openxmlformats.org/drawingml/2006/picture">
+                <pic:pic xmlns:pic="http://schemas.openxmlformats.org/drawingml/2006/picture">
+                  <pic:nvPicPr>
+                    <pic:cNvPr id="1" name=""/>
+                    <pic:cNvPicPr/>
+                  </pic:nvPicPr>
+                  <pic:blipFill>
+                    <a:blip r:embed="rId17"/>
+                    <a:stretch>
+                      <a:fillRect/>
+                    </a:stretch>
+                  </pic:blipFill>
+                  <pic:spPr>
+                    <a:xfrm>
+                      <a:off x="0" y="0"/>
+                      <a:ext cx="5943600" cy="3112135"/>
+                    </a:xfrm>
+                    <a:prstGeom prst="rect">
+                      <a:avLst/>
+                    </a:prstGeom>
+                  </pic:spPr>
+                </pic:pic>
+              </a:graphicData>
+            </a:graphic>
+          </wp:inline>
+        </w:drawing>
+      </w:r>
+    </w:p>
+    <w:p>
+      <w:pPr>
+        <w:keepNext w:val="0"/>
+        <w:spacing w:before="40" w:after="160"/>
+        <w:jc w:val="center"/>
+      </w:pPr>
+      <w:r>
+        <w:rPr>
+          <w:i/>
+          <w:sz w:val="18"/>
+        </w:rPr>
+        <w:t>Figure 12. Row selection of Alice Johnson with accessible selection controls and selection feedback.</w:t>
+      </w:r>
+    </w:p>
+    <w:p>
+      <w:r>
+        <w:rPr>
+          <w:noProof/>
+        </w:rPr>
+        <w:drawing>
+          <wp:inline distT="0" distB="0" distL="0" distR="0" wp14:anchorId="5194F16E" wp14:editId="0DA926A4">
+            <wp:extent cx="5943600" cy="2890520"/>
+            <wp:effectExtent l="0" t="0" r="0" b="5080"/>
+            <wp:docPr id="9" name="Picture 9"/>
+            <wp:cNvGraphicFramePr>
+              <a:graphicFrameLocks xmlns:a="http://schemas.openxmlformats.org/drawingml/2006/main" noChangeAspect="1"/>
+            </wp:cNvGraphicFramePr>
+            <a:graphic xmlns:a="http://schemas.openxmlformats.org/drawingml/2006/main">
+              <a:graphicData uri="http://schemas.openxmlformats.org/drawingml/2006/picture">
+                <pic:pic xmlns:pic="http://schemas.openxmlformats.org/drawingml/2006/picture">
+                  <pic:nvPicPr>
+                    <pic:cNvPr id="1" name=""/>
+                    <pic:cNvPicPr/>
+                  </pic:nvPicPr>
+                  <pic:blipFill>
+                    <a:blip r:embed="rId18"/>
+                    <a:stretch>
+                      <a:fillRect/>
+                    </a:stretch>
+                  </pic:blipFill>
+                  <pic:spPr>
+                    <a:xfrm>
+                      <a:off x="0" y="0"/>
+                      <a:ext cx="5943600" cy="2890520"/>
+                    </a:xfrm>
+                    <a:prstGeom prst="rect">
+                      <a:avLst/>
+                    </a:prstGeom>
+                  </pic:spPr>
+                </pic:pic>
+              </a:graphicData>
+            </a:graphic>
+          </wp:inline>
+        </w:drawing>
+      </w:r>
+    </w:p>
+    <w:p>
+      <w:pPr>
+        <w:keepNext w:val="0"/>
+        <w:spacing w:before="40" w:after="160"/>
+        <w:jc w:val="center"/>
+      </w:pPr>
+      <w:r>
+        <w:rPr>
+          <w:i/>
+          <w:sz w:val="18"/>
+        </w:rPr>
+        <w:t>Figure 13. Correct row selection of David Brown after applying the Engineering filter.</w:t>
+      </w:r>
+    </w:p>
+    <w:p>
+      <w:r>
+        <w:rPr>
+          <w:noProof/>
+        </w:rPr>
+        <w:lastRenderedPageBreak/>
+        <w:drawing>
+          <wp:inline distT="0" distB="0" distL="0" distR="0" wp14:anchorId="529A8F8B" wp14:editId="61111C9A">
+            <wp:extent cx="5943600" cy="3238500"/>
+            <wp:effectExtent l="0" t="0" r="0" b="0"/>
+            <wp:docPr id="10" name="Picture 10"/>
+            <wp:cNvGraphicFramePr>
+              <a:graphicFrameLocks xmlns:a="http://schemas.openxmlformats.org/drawingml/2006/main" noChangeAspect="1"/>
+            </wp:cNvGraphicFramePr>
+            <a:graphic xmlns:a="http://schemas.openxmlformats.org/drawingml/2006/main">
+              <a:graphicData uri="http://schemas.openxmlformats.org/drawingml/2006/picture">
+                <pic:pic xmlns:pic="http://schemas.openxmlformats.org/drawingml/2006/picture">
+                  <pic:nvPicPr>
+                    <pic:cNvPr id="1" name=""/>
+                    <pic:cNvPicPr/>
+                  </pic:nvPicPr>
+                  <pic:blipFill>
+                    <a:blip r:embed="rId19"/>
+                    <a:stretch>
+                      <a:fillRect/>
+                    </a:stretch>
+                  </pic:blipFill>
+                  <pic:spPr>
+                    <a:xfrm>
+                      <a:off x="0" y="0"/>
+                      <a:ext cx="5943600" cy="3238500"/>
+                    </a:xfrm>
+                    <a:prstGeom prst="rect">
+                      <a:avLst/>
+                    </a:prstGeom>
+                  </pic:spPr>
+                </pic:pic>
+              </a:graphicData>
+            </a:graphic>
+          </wp:inline>
+        </w:drawing>
+      </w:r>
+    </w:p>
+    <w:p>
+      <w:pPr>
+        <w:keepNext w:val="0"/>
+        <w:spacing w:before="40" w:after="160"/>
+        <w:jc w:val="center"/>
+      </w:pPr>
+      <w:r>
+        <w:rPr>
+          <w:i/>
+          <w:sz w:val="18"/>
+        </w:rPr>
+        <w:t>Figure 14. Visible keyboard focus on a DataGrid cell using roving tabindex navigation.</w:t>
+      </w:r>
+    </w:p>
+    <w:p>
+      <w:r>
+        <w:rPr>
+          <w:noProof/>
+        </w:rPr>
+        <w:drawing>
+          <wp:inline distT="0" distB="0" distL="0" distR="0" wp14:anchorId="03BB7BB8" wp14:editId="0B7AC6D5">
+            <wp:extent cx="5943600" cy="3421380"/>
+            <wp:effectExtent l="0" t="0" r="0" b="7620"/>
+            <wp:docPr id="11" name="Picture 11"/>
+            <wp:cNvGraphicFramePr>
+              <a:graphicFrameLocks xmlns:a="http://schemas.openxmlformats.org/drawingml/2006/main" noChangeAspect="1"/>
+            </wp:cNvGraphicFramePr>
+            <a:graphic xmlns:a="http://schemas.openxmlformats.org/drawingml/2006/main">
+              <a:graphicData uri="http://schemas.openxmlformats.org/drawingml/2006/picture">
+                <pic:pic xmlns:pic="http://schemas.openxmlformats.org/drawingml/2006/picture">
+                  <pic:nvPicPr>
+                    <pic:cNvPr id="1" name=""/>
+                    <pic:cNvPicPr/>
+                  </pic:nvPicPr>
+                  <pic:blipFill>
+                    <a:blip r:embed="rId20"/>
+                    <a:stretch>
+                      <a:fillRect/>
+                    </a:stretch>
+                  </pic:blipFill>
+                  <pic:spPr>
+                    <a:xfrm>
+                      <a:off x="0" y="0"/>
                       <a:ext cx="5943600" cy="3421380"/>
                     </a:xfrm>
                     <a:prstGeom prst="rect">
@@ -440,10 +859,28 @@
           </wp:inline>
         </w:drawing>
       </w:r>
-      <w:bookmarkStart w:id="0" w:name="_GoBack"/>
-      <w:bookmarkEnd w:id="0"/>
+    </w:p>
+    <w:p>
+      <w:pPr>
+        <w:keepNext w:val="0"/>
+        <w:spacing w:before="40" w:after="160"/>
+        <w:jc w:val="center"/>
+      </w:pPr>
+      <w:r>
+        <w:rPr>
+          <w:i/>
+          <w:sz w:val="18"/>
+        </w:rPr>
+        <w:t>Figure 15. Keyboard-based row selection of David Brown with visible focus and updated selection feedback.</w:t>
+      </w:r>
     </w:p>
     <w:sectPr>
+      <w:headerReference w:type="even" r:id="rId21"/>
+      <w:headerReference w:type="default" r:id="rId22"/>
+      <w:footerReference w:type="even" r:id="rId23"/>
+      <w:footerReference w:type="default" r:id="rId24"/>
+      <w:headerReference w:type="first" r:id="rId25"/>
+      <w:footerReference w:type="first" r:id="rId26"/>
       <w:pgSz w:w="12240" w:h="15840"/>
       <w:pgMar w:top="1440" w:right="1440" w:bottom="1440" w:left="1440" w:header="708" w:footer="708" w:gutter="0"/>
       <w:cols w:space="708"/>
@@ -451,6 +888,118 @@
     </w:sectPr>
   </w:body>
 </w:document>
+</file>
+
+<file path=word/endnotes.xml><?xml version="1.0" encoding="utf-8"?>
+<w:endnotes xmlns:wpc="http://schemas.microsoft.com/office/word/2010/wordprocessingCanvas" xmlns:mc="http://schemas.openxmlformats.org/markup-compatibility/2006" xmlns:o="urn:schemas-microsoft-com:office:office" xmlns:r="http://schemas.openxmlformats.org/officeDocument/2006/relationships" xmlns:m="http://schemas.openxmlformats.org/officeDocument/2006/math" xmlns:v="urn:schemas-microsoft-com:vml" xmlns:wp14="http://schemas.microsoft.com/office/word/2010/wordprocessingDrawing" xmlns:wp="http://schemas.openxmlformats.org/drawingml/2006/wordprocessingDrawing" xmlns:w10="urn:schemas-microsoft-com:office:word" xmlns:w="http://schemas.openxmlformats.org/wordprocessingml/2006/main" xmlns:w14="http://schemas.microsoft.com/office/word/2010/wordml" xmlns:w15="http://schemas.microsoft.com/office/word/2012/wordml" xmlns:wpg="http://schemas.microsoft.com/office/word/2010/wordprocessingGroup" xmlns:wpi="http://schemas.microsoft.com/office/word/2010/wordprocessingInk" xmlns:wne="http://schemas.microsoft.com/office/word/2006/wordml" xmlns:wps="http://schemas.microsoft.com/office/word/2010/wordprocessingShape" mc:Ignorable="w14 w15 wp14">
+  <w:endnote w:type="separator" w:id="-1">
+    <w:p>
+      <w:pPr>
+        <w:spacing w:after="0" w:line="240" w:lineRule="auto"/>
+      </w:pPr>
+      <w:r>
+        <w:separator/>
+      </w:r>
+    </w:p>
+  </w:endnote>
+  <w:endnote w:type="continuationSeparator" w:id="0">
+    <w:p>
+      <w:pPr>
+        <w:spacing w:after="0" w:line="240" w:lineRule="auto"/>
+      </w:pPr>
+      <w:r>
+        <w:continuationSeparator/>
+      </w:r>
+    </w:p>
+  </w:endnote>
+</w:endnotes>
+</file>
+
+<file path=word/footer1.xml><?xml version="1.0" encoding="utf-8"?>
+<w:ftr xmlns:wpc="http://schemas.microsoft.com/office/word/2010/wordprocessingCanvas" xmlns:mc="http://schemas.openxmlformats.org/markup-compatibility/2006" xmlns:o="urn:schemas-microsoft-com:office:office" xmlns:r="http://schemas.openxmlformats.org/officeDocument/2006/relationships" xmlns:m="http://schemas.openxmlformats.org/officeDocument/2006/math" xmlns:v="urn:schemas-microsoft-com:vml" xmlns:wp14="http://schemas.microsoft.com/office/word/2010/wordprocessingDrawing" xmlns:wp="http://schemas.openxmlformats.org/drawingml/2006/wordprocessingDrawing" xmlns:w10="urn:schemas-microsoft-com:office:word" xmlns:w="http://schemas.openxmlformats.org/wordprocessingml/2006/main" xmlns:w14="http://schemas.microsoft.com/office/word/2010/wordml" xmlns:w15="http://schemas.microsoft.com/office/word/2012/wordml" xmlns:wpg="http://schemas.microsoft.com/office/word/2010/wordprocessingGroup" xmlns:wpi="http://schemas.microsoft.com/office/word/2010/wordprocessingInk" xmlns:wne="http://schemas.microsoft.com/office/word/2006/wordml" xmlns:wps="http://schemas.microsoft.com/office/word/2010/wordprocessingShape" mc:Ignorable="w14 w15 wp14">
+  <w:p>
+    <w:pPr>
+      <w:pStyle w:val="Footer"/>
+    </w:pPr>
+  </w:p>
+</w:ftr>
+</file>
+
+<file path=word/footer2.xml><?xml version="1.0" encoding="utf-8"?>
+<w:ftr xmlns:wpc="http://schemas.microsoft.com/office/word/2010/wordprocessingCanvas" xmlns:mc="http://schemas.openxmlformats.org/markup-compatibility/2006" xmlns:o="urn:schemas-microsoft-com:office:office" xmlns:r="http://schemas.openxmlformats.org/officeDocument/2006/relationships" xmlns:m="http://schemas.openxmlformats.org/officeDocument/2006/math" xmlns:v="urn:schemas-microsoft-com:vml" xmlns:wp14="http://schemas.microsoft.com/office/word/2010/wordprocessingDrawing" xmlns:wp="http://schemas.openxmlformats.org/drawingml/2006/wordprocessingDrawing" xmlns:w10="urn:schemas-microsoft-com:office:word" xmlns:w="http://schemas.openxmlformats.org/wordprocessingml/2006/main" xmlns:w14="http://schemas.microsoft.com/office/word/2010/wordml" xmlns:w15="http://schemas.microsoft.com/office/word/2012/wordml" xmlns:wpg="http://schemas.microsoft.com/office/word/2010/wordprocessingGroup" xmlns:wpi="http://schemas.microsoft.com/office/word/2010/wordprocessingInk" xmlns:wne="http://schemas.microsoft.com/office/word/2006/wordml" xmlns:wps="http://schemas.microsoft.com/office/word/2010/wordprocessingShape" mc:Ignorable="w14 w15 wp14">
+  <w:p>
+    <w:pPr>
+      <w:pStyle w:val="Footer"/>
+    </w:pPr>
+    <w:bookmarkStart w:id="0" w:name="_GoBack"/>
+    <w:bookmarkEnd w:id="0"/>
+  </w:p>
+</w:ftr>
+</file>
+
+<file path=word/footer3.xml><?xml version="1.0" encoding="utf-8"?>
+<w:ftr xmlns:wpc="http://schemas.microsoft.com/office/word/2010/wordprocessingCanvas" xmlns:mc="http://schemas.openxmlformats.org/markup-compatibility/2006" xmlns:o="urn:schemas-microsoft-com:office:office" xmlns:r="http://schemas.openxmlformats.org/officeDocument/2006/relationships" xmlns:m="http://schemas.openxmlformats.org/officeDocument/2006/math" xmlns:v="urn:schemas-microsoft-com:vml" xmlns:wp14="http://schemas.microsoft.com/office/word/2010/wordprocessingDrawing" xmlns:wp="http://schemas.openxmlformats.org/drawingml/2006/wordprocessingDrawing" xmlns:w10="urn:schemas-microsoft-com:office:word" xmlns:w="http://schemas.openxmlformats.org/wordprocessingml/2006/main" xmlns:w14="http://schemas.microsoft.com/office/word/2010/wordml" xmlns:w15="http://schemas.microsoft.com/office/word/2012/wordml" xmlns:wpg="http://schemas.microsoft.com/office/word/2010/wordprocessingGroup" xmlns:wpi="http://schemas.microsoft.com/office/word/2010/wordprocessingInk" xmlns:wne="http://schemas.microsoft.com/office/word/2006/wordml" xmlns:wps="http://schemas.microsoft.com/office/word/2010/wordprocessingShape" mc:Ignorable="w14 w15 wp14">
+  <w:p>
+    <w:pPr>
+      <w:pStyle w:val="Footer"/>
+    </w:pPr>
+  </w:p>
+</w:ftr>
+</file>
+
+<file path=word/footnotes.xml><?xml version="1.0" encoding="utf-8"?>
+<w:footnotes xmlns:wpc="http://schemas.microsoft.com/office/word/2010/wordprocessingCanvas" xmlns:mc="http://schemas.openxmlformats.org/markup-compatibility/2006" xmlns:o="urn:schemas-microsoft-com:office:office" xmlns:r="http://schemas.openxmlformats.org/officeDocument/2006/relationships" xmlns:m="http://schemas.openxmlformats.org/officeDocument/2006/math" xmlns:v="urn:schemas-microsoft-com:vml" xmlns:wp14="http://schemas.microsoft.com/office/word/2010/wordprocessingDrawing" xmlns:wp="http://schemas.openxmlformats.org/drawingml/2006/wordprocessingDrawing" xmlns:w10="urn:schemas-microsoft-com:office:word" xmlns:w="http://schemas.openxmlformats.org/wordprocessingml/2006/main" xmlns:w14="http://schemas.microsoft.com/office/word/2010/wordml" xmlns:w15="http://schemas.microsoft.com/office/word/2012/wordml" xmlns:wpg="http://schemas.microsoft.com/office/word/2010/wordprocessingGroup" xmlns:wpi="http://schemas.microsoft.com/office/word/2010/wordprocessingInk" xmlns:wne="http://schemas.microsoft.com/office/word/2006/wordml" xmlns:wps="http://schemas.microsoft.com/office/word/2010/wordprocessingShape" mc:Ignorable="w14 w15 wp14">
+  <w:footnote w:type="separator" w:id="-1">
+    <w:p>
+      <w:pPr>
+        <w:spacing w:after="0" w:line="240" w:lineRule="auto"/>
+      </w:pPr>
+      <w:r>
+        <w:separator/>
+      </w:r>
+    </w:p>
+  </w:footnote>
+  <w:footnote w:type="continuationSeparator" w:id="0">
+    <w:p>
+      <w:pPr>
+        <w:spacing w:after="0" w:line="240" w:lineRule="auto"/>
+      </w:pPr>
+      <w:r>
+        <w:continuationSeparator/>
+      </w:r>
+    </w:p>
+  </w:footnote>
+</w:footnotes>
+</file>
+
+<file path=word/header1.xml><?xml version="1.0" encoding="utf-8"?>
+<w:hdr xmlns:wpc="http://schemas.microsoft.com/office/word/2010/wordprocessingCanvas" xmlns:mc="http://schemas.openxmlformats.org/markup-compatibility/2006" xmlns:o="urn:schemas-microsoft-com:office:office" xmlns:r="http://schemas.openxmlformats.org/officeDocument/2006/relationships" xmlns:m="http://schemas.openxmlformats.org/officeDocument/2006/math" xmlns:v="urn:schemas-microsoft-com:vml" xmlns:wp14="http://schemas.microsoft.com/office/word/2010/wordprocessingDrawing" xmlns:wp="http://schemas.openxmlformats.org/drawingml/2006/wordprocessingDrawing" xmlns:w10="urn:schemas-microsoft-com:office:word" xmlns:w="http://schemas.openxmlformats.org/wordprocessingml/2006/main" xmlns:w14="http://schemas.microsoft.com/office/word/2010/wordml" xmlns:w15="http://schemas.microsoft.com/office/word/2012/wordml" xmlns:wpg="http://schemas.microsoft.com/office/word/2010/wordprocessingGroup" xmlns:wpi="http://schemas.microsoft.com/office/word/2010/wordprocessingInk" xmlns:wne="http://schemas.microsoft.com/office/word/2006/wordml" xmlns:wps="http://schemas.microsoft.com/office/word/2010/wordprocessingShape" mc:Ignorable="w14 w15 wp14">
+  <w:p>
+    <w:pPr>
+      <w:pStyle w:val="Header"/>
+    </w:pPr>
+  </w:p>
+</w:hdr>
+</file>
+
+<file path=word/header2.xml><?xml version="1.0" encoding="utf-8"?>
+<w:hdr xmlns:wpc="http://schemas.microsoft.com/office/word/2010/wordprocessingCanvas" xmlns:mc="http://schemas.openxmlformats.org/markup-compatibility/2006" xmlns:o="urn:schemas-microsoft-com:office:office" xmlns:r="http://schemas.openxmlformats.org/officeDocument/2006/relationships" xmlns:m="http://schemas.openxmlformats.org/officeDocument/2006/math" xmlns:v="urn:schemas-microsoft-com:vml" xmlns:wp14="http://schemas.microsoft.com/office/word/2010/wordprocessingDrawing" xmlns:wp="http://schemas.openxmlformats.org/drawingml/2006/wordprocessingDrawing" xmlns:w10="urn:schemas-microsoft-com:office:word" xmlns:w="http://schemas.openxmlformats.org/wordprocessingml/2006/main" xmlns:w14="http://schemas.microsoft.com/office/word/2010/wordml" xmlns:w15="http://schemas.microsoft.com/office/word/2012/wordml" xmlns:wpg="http://schemas.microsoft.com/office/word/2010/wordprocessingGroup" xmlns:wpi="http://schemas.microsoft.com/office/word/2010/wordprocessingInk" xmlns:wne="http://schemas.microsoft.com/office/word/2006/wordml" xmlns:wps="http://schemas.microsoft.com/office/word/2010/wordprocessingShape" mc:Ignorable="w14 w15 wp14">
+  <w:p>
+    <w:pPr>
+      <w:pStyle w:val="Header"/>
+    </w:pPr>
+  </w:p>
+</w:hdr>
+</file>
+
+<file path=word/header3.xml><?xml version="1.0" encoding="utf-8"?>
+<w:hdr xmlns:wpc="http://schemas.microsoft.com/office/word/2010/wordprocessingCanvas" xmlns:mc="http://schemas.openxmlformats.org/markup-compatibility/2006" xmlns:o="urn:schemas-microsoft-com:office:office" xmlns:r="http://schemas.openxmlformats.org/officeDocument/2006/relationships" xmlns:m="http://schemas.openxmlformats.org/officeDocument/2006/math" xmlns:v="urn:schemas-microsoft-com:vml" xmlns:wp14="http://schemas.microsoft.com/office/word/2010/wordprocessingDrawing" xmlns:wp="http://schemas.openxmlformats.org/drawingml/2006/wordprocessingDrawing" xmlns:w10="urn:schemas-microsoft-com:office:word" xmlns:w="http://schemas.openxmlformats.org/wordprocessingml/2006/main" xmlns:w14="http://schemas.microsoft.com/office/word/2010/wordml" xmlns:w15="http://schemas.microsoft.com/office/word/2012/wordml" xmlns:wpg="http://schemas.microsoft.com/office/word/2010/wordprocessingGroup" xmlns:wpi="http://schemas.microsoft.com/office/word/2010/wordprocessingInk" xmlns:wne="http://schemas.microsoft.com/office/word/2006/wordml" xmlns:wps="http://schemas.microsoft.com/office/word/2010/wordprocessingShape" mc:Ignorable="w14 w15 wp14">
+  <w:p>
+    <w:pPr>
+      <w:pStyle w:val="Header"/>
+    </w:pPr>
+  </w:p>
+</w:hdr>
 </file>
 
 <file path=word/styles.xml><?xml version="1.0" encoding="utf-8"?>
@@ -874,6 +1423,50 @@
     <w:semiHidden/>
     <w:unhideWhenUsed/>
   </w:style>
+  <w:style w:type="paragraph" w:styleId="Header">
+    <w:name w:val="header"/>
+    <w:basedOn w:val="Normal"/>
+    <w:link w:val="HeaderChar"/>
+    <w:uiPriority w:val="99"/>
+    <w:unhideWhenUsed/>
+    <w:rsid w:val="00037349"/>
+    <w:pPr>
+      <w:tabs>
+        <w:tab w:val="center" w:pos="4680"/>
+        <w:tab w:val="right" w:pos="9360"/>
+      </w:tabs>
+      <w:spacing w:after="0" w:line="240" w:lineRule="auto"/>
+    </w:pPr>
+  </w:style>
+  <w:style w:type="character" w:customStyle="1" w:styleId="HeaderChar">
+    <w:name w:val="Header Char"/>
+    <w:basedOn w:val="DefaultParagraphFont"/>
+    <w:link w:val="Header"/>
+    <w:uiPriority w:val="99"/>
+    <w:rsid w:val="00037349"/>
+  </w:style>
+  <w:style w:type="paragraph" w:styleId="Footer">
+    <w:name w:val="footer"/>
+    <w:basedOn w:val="Normal"/>
+    <w:link w:val="FooterChar"/>
+    <w:uiPriority w:val="99"/>
+    <w:unhideWhenUsed/>
+    <w:rsid w:val="00037349"/>
+    <w:pPr>
+      <w:tabs>
+        <w:tab w:val="center" w:pos="4680"/>
+        <w:tab w:val="right" w:pos="9360"/>
+      </w:tabs>
+      <w:spacing w:after="0" w:line="240" w:lineRule="auto"/>
+    </w:pPr>
+  </w:style>
+  <w:style w:type="character" w:customStyle="1" w:styleId="FooterChar">
+    <w:name w:val="Footer Char"/>
+    <w:basedOn w:val="DefaultParagraphFont"/>
+    <w:link w:val="Footer"/>
+    <w:uiPriority w:val="99"/>
+    <w:rsid w:val="00037349"/>
+  </w:style>
 </w:styles>
 </file>
 

</xml_diff>